<commit_message>
release: 0.19.0 Connected (roadmap v8, second pass)
CHANGELOG entry, version bump, roadmap progress with the held-out
baseline and its known misses, CLAUDE.md module map, and the demo bundle
regenerated on 0.19.0 (PDFs included). The enterprise-contribution tile
now quotes its strongest evidence (comparison group before baseline).

Co-Authored-By: Claude Opus 5.5 <noreply@anthropic.com>
</commit_message>
<xml_diff>
--- a/demo/kampung_makmur_sdn_bhd/kampung_makmur_sdn_bhd_ic_memo.docx
+++ b/demo/kampung_makmur_sdn_bhd/kampung_makmur_sdn_bhd_ic_memo.docx
@@ -21,7 +21,7 @@
         <w:t>Date</w:t>
       </w:r>
       <w:r>
-        <w:t>: 2026-10-08</w:t>
+        <w:t>: 2026-10-09</w:t>
       </w:r>
     </w:p>
     <w:p>
@@ -212,10 +212,10 @@
         <w:rPr>
           <w:b/>
         </w:rPr>
-        <w:t>1.83/5</w:t>
+        <w:t>1.95/5</w:t>
       </w:r>
       <w:r>
-        <w:t xml:space="preserve"> (unweighted: 1.8/5)</w:t>
+        <w:t xml:space="preserve"> (unweighted: 1.9/5)</w:t>
       </w:r>
     </w:p>
     <w:p>
@@ -587,7 +587,7 @@
               <w:rPr>
                 <w:sz w:val="19"/>
               </w:rPr>
-              <w:t>1.3/5</w:t>
+              <w:t>1.9/5</w:t>
             </w:r>
           </w:p>
         </w:tc>
@@ -621,7 +621,7 @@
               <w:rPr>
                 <w:sz w:val="19"/>
               </w:rPr>
-              <w:t>Depth=1.3, Duration=1.3</w:t>
+              <w:t>Depth=1.9, Duration=1.9</w:t>
             </w:r>
           </w:p>
         </w:tc>
@@ -729,7 +729,7 @@
                 <w:b/>
                 <w:sz w:val="19"/>
               </w:rPr>
-              <w:t>1.8/5</w:t>
+              <w:t>1.9/5</w:t>
             </w:r>
           </w:p>
         </w:tc>
@@ -1495,7 +1495,7 @@
               <w:rPr>
                 <w:sz w:val="19"/>
               </w:rPr>
-              <w:t>1.8</w:t>
+              <w:t>1.9</w:t>
             </w:r>
           </w:p>
         </w:tc>
@@ -1529,7 +1529,7 @@
               <w:rPr>
                 <w:sz w:val="19"/>
               </w:rPr>
-              <w:t>5D overall 1.8 vs. min 2.5</w:t>
+              <w:t>5D overall 1.9 vs. min 2.5</w:t>
             </w:r>
           </w:p>
         </w:tc>
@@ -1897,7 +1897,7 @@
         <w:pStyle w:val="ListBullet"/>
       </w:pPr>
       <w:r>
-        <w:t>❌ 5D overall 1.8 vs. min 2.5</w:t>
+        <w:t>❌ 5D overall 1.9 vs. min 2.5</w:t>
       </w:r>
     </w:p>
     <w:p>

</xml_diff>